<commit_message>
Revisar estilo del artículo: menos dos puntos, redacción más natural y coherente
Co-Authored-By: Claude Opus 5.5 <noreply@anthropic.com>
Claude-Session: https://claude.ai/code/session_0151xMeAGxojZGQ6vZDDk9eo
</commit_message>
<xml_diff>
--- a/Articulo_desconfianza_clase_politica.docx
+++ b/Articulo_desconfianza_clase_politica.docx
@@ -11,7 +11,7 @@
         <w:rPr>
           <w:rFonts w:ascii="Calibri" w:cs="Calibri" w:eastAsia="Calibri" w:hAnsi="Calibri"/>
         </w:rPr>
-        <w:t xml:space="preserve">Desconfianza en la clase política: el dato que mejor explica la política española</w:t>
+        <w:t xml:space="preserve">La desconfianza, el dato que mejor explica la política española</w:t>
       </w:r>
     </w:p>
     <w:p>
@@ -53,7 +53,7 @@
         </w:rPr>
         <w:t xml:space="preserve">El 22 de junio de 2026, el Tribunal Supremo condenó al exministro José Luis Ábalos a 24 años y tres meses de prisión por organización criminal, cohecho, malversación y tráfico de influencias (</w:t>
       </w:r>
-      <w:hyperlink w:history="1" r:id="rIdb4i3fh7ldiscewbjfu93s">
+      <w:hyperlink r:id="rIdb4i3fh7ldiscewbjfu93s" w:history="1">
         <w:r>
           <w:rPr>
             <w:rStyle w:val="Hyperlink"/>
@@ -70,7 +70,7 @@
         </w:rPr>
         <w:t xml:space="preserve">; </w:t>
       </w:r>
-      <w:hyperlink w:history="1" r:id="rIdecodz83qmntlb1w48b0yj">
+      <w:hyperlink r:id="rIdecodz83qmntlb1w48b0yj" w:history="1">
         <w:r>
           <w:rPr>
             <w:rStyle w:val="Hyperlink"/>
@@ -87,7 +87,7 @@
         </w:rPr>
         <w:t xml:space="preserve">). La sentencia cierra una legislatura marcada por los casos judiciales que afectan al partido del Gobierno (</w:t>
       </w:r>
-      <w:hyperlink w:history="1" r:id="rIdes4dwkddm4hgus4gx4fxd">
+      <w:hyperlink r:id="rIdes4dwkddm4hgus4gx4fxd" w:history="1">
         <w:r>
           <w:rPr>
             <w:rStyle w:val="Hyperlink"/>
@@ -102,9 +102,9 @@
         <w:rPr>
           <w:rFonts w:ascii="Calibri" w:cs="Calibri" w:eastAsia="Calibri" w:hAnsi="Calibri"/>
         </w:rPr>
-        <w:t xml:space="preserve">) y que terminará con elecciones generales anticipadas el 29 de noviembre (</w:t>
-      </w:r>
-      <w:hyperlink w:history="1" r:id="rIdpkmydo_rspw-6srxrisyp">
+        <w:t xml:space="preserve">), y que terminará con elecciones generales anticipadas el 29 de noviembre (</w:t>
+      </w:r>
+      <w:hyperlink r:id="rIdpkmydo_rspw-6srxrisyp" w:history="1">
         <w:r>
           <w:rPr>
             <w:rStyle w:val="Hyperlink"/>
@@ -119,31 +119,31 @@
         <w:rPr>
           <w:rFonts w:ascii="Calibri" w:cs="Calibri" w:eastAsia="Calibri" w:hAnsi="Calibri"/>
         </w:rPr>
-        <w:t xml:space="preserve">). Más allá de su recorrido judicial, estos casos plantean una cuestión de fondo: cuánto confía la ciudadanía en sus representantes.</w:t>
-      </w:r>
-    </w:p>
-    <w:p>
-      <w:pPr>
-        <w:spacing w:after="160" w:line="300"/>
-        <w:jc w:val="both"/>
-      </w:pPr>
-      <w:r>
-        <w:rPr>
-          <w:rFonts w:ascii="Calibri" w:cs="Calibri" w:eastAsia="Calibri" w:hAnsi="Calibri"/>
-        </w:rPr>
-        <w:t xml:space="preserve">Los datos de la European Social Survey (ESS) permiten medirlo. En 2024, los españoles puntúan a los políticos y a los partidos con un 2,76 sobre 10, y en torno al 61% les otorga entre 0 y 3. La policía, en cambio, obtiene un 6,92. La desconfianza no se dirige al Estado en su conjunto, sino a las instituciones de representación política.</w:t>
-      </w:r>
-    </w:p>
-    <w:p>
-      <w:pPr>
-        <w:spacing w:after="160" w:line="300"/>
-        <w:jc w:val="both"/>
-      </w:pPr>
-      <w:r>
-        <w:rPr>
-          <w:rFonts w:ascii="Calibri" w:cs="Calibri" w:eastAsia="Calibri" w:hAnsi="Calibri"/>
-        </w:rPr>
-        <w:t xml:space="preserve">Este artículo sostiene que la desconfianza hacia la clase política es el dato que mejor resume el momento político español, y se pregunta por sus motivos. La literatura sobre España señala dos causas de fondo: la corrupción y la percepción de que las instituciones no responden a la ciudadanía. Los microdatos de la ESS confirman la segunda: la sensación de no tener voz es, junto con la economía, lo que más se asocia a la desconfianza, mientras que la ideología apenas influye. Esa desconfianza se expresa también en las urnas, a través de la abstención.</w:t>
+        <w:t xml:space="preserve">). Estos casos tienen un recorrido judicial, pero también plantean una pregunta política. ¿Cuánto confían los españoles en quienes los representan?</w:t>
+      </w:r>
+    </w:p>
+    <w:p>
+      <w:pPr>
+        <w:spacing w:after="160" w:line="300"/>
+        <w:jc w:val="both"/>
+      </w:pPr>
+      <w:r>
+        <w:rPr>
+          <w:rFonts w:ascii="Calibri" w:cs="Calibri" w:eastAsia="Calibri" w:hAnsi="Calibri"/>
+        </w:rPr>
+        <w:t xml:space="preserve">La European Social Survey (ESS) permite responderla. En 2024, los españoles ponen a los políticos y a los partidos un 2,76 sobre 10, y en torno al 61% les da entre 0 y 3. La policía, en cambio, obtiene un 6,92. La desconfianza apunta, por tanto, a los representantes políticos, y mucho menos al resto del Estado.</w:t>
+      </w:r>
+    </w:p>
+    <w:p>
+      <w:pPr>
+        <w:spacing w:after="160" w:line="300"/>
+        <w:jc w:val="both"/>
+      </w:pPr>
+      <w:r>
+        <w:rPr>
+          <w:rFonts w:ascii="Calibri" w:cs="Calibri" w:eastAsia="Calibri" w:hAnsi="Calibri"/>
+        </w:rPr>
+        <w:t xml:space="preserve">Mi tesis es que la desconfianza hacia la clase política es el dato que mejor resume el momento político español, y me pregunto por sus motivos. La literatura sobre España señala dos causas de fondo, la corrupción y la sensación de que las instituciones no responden a la ciudadanía. Los microdatos de la ESS respaldan la segunda. Sentir que no se tiene voz es, junto con la economía, lo que más se asocia a la desconfianza, y la ideología apenas influye. Esa desconfianza se nota también en las urnas, a través de la abstención.</w:t>
       </w:r>
     </w:p>
     <w:p>
@@ -154,19 +154,19 @@
         <w:rPr>
           <w:rFonts w:ascii="Calibri" w:cs="Calibri" w:eastAsia="Calibri" w:hAnsi="Calibri"/>
         </w:rPr>
-        <w:t xml:space="preserve">El debate: por qué se desconfía de la política</w:t>
-      </w:r>
-    </w:p>
-    <w:p>
-      <w:pPr>
-        <w:spacing w:after="160" w:line="300"/>
-        <w:jc w:val="both"/>
-      </w:pPr>
-      <w:r>
-        <w:rPr>
-          <w:rFonts w:ascii="Calibri" w:cs="Calibri" w:eastAsia="Calibri" w:hAnsi="Calibri"/>
-        </w:rPr>
-        <w:t xml:space="preserve">Los estudios sobre España coinciden en señalar tres motivos de la desconfianza política, aunque discrepan sobre el peso de cada uno.</w:t>
+        <w:t xml:space="preserve">Por qué se desconfía de la política</w:t>
+      </w:r>
+    </w:p>
+    <w:p>
+      <w:pPr>
+        <w:spacing w:after="160" w:line="300"/>
+        <w:jc w:val="both"/>
+      </w:pPr>
+      <w:r>
+        <w:rPr>
+          <w:rFonts w:ascii="Calibri" w:cs="Calibri" w:eastAsia="Calibri" w:hAnsi="Calibri"/>
+        </w:rPr>
+        <w:t xml:space="preserve">Los estudios sobre España coinciden en tres motivos, aunque no les dan el mismo peso.</w:t>
       </w:r>
     </w:p>
     <w:p>
@@ -194,7 +194,7 @@
         </w:rPr>
         <w:t xml:space="preserve">. Villoria y Jiménez (</w:t>
       </w:r>
-      <w:hyperlink w:history="1" r:id="rId8w27sphhbtcduxah_lk-s">
+      <w:hyperlink r:id="rId8w27sphhbtcduxah_lk-s" w:history="1">
         <w:r>
           <w:rPr>
             <w:rStyle w:val="Hyperlink"/>
@@ -209,9 +209,9 @@
         <w:rPr>
           <w:rFonts w:ascii="Calibri" w:cs="Calibri" w:eastAsia="Calibri" w:hAnsi="Calibri"/>
         </w:rPr>
-        <w:t xml:space="preserve">) analizan la extensión de la corrupción en España entre 2004 y 2010, su percepción social y sus efectos. Villoria, Van Ryzin y Lavena (</w:t>
-      </w:r>
-      <w:hyperlink w:history="1" r:id="rIdq-wblfcwk3x5ca-vue6we">
+        <w:t xml:space="preserve">) analizan cuánta corrupción hubo en España entre 2004 y 2010, cómo la percibió la sociedad y qué efectos tuvo. Villoria, Van Ryzin y Lavena (</w:t>
+      </w:r>
+      <w:hyperlink r:id="rIdq-wblfcwk3x5ca-vue6we" w:history="1">
         <w:r>
           <w:rPr>
             <w:rStyle w:val="Hyperlink"/>
@@ -228,7 +228,7 @@
         </w:rPr>
         <w:t xml:space="preserve">) encuentran que quienes perciben más corrupción están menos satisfechos con la democracia y confían menos en las instituciones. Solé-Ollé y Sorribas-Navarro (</w:t>
       </w:r>
-      <w:hyperlink w:history="1" r:id="rIdcbybk0v1ilnkmjrqsvf3s">
+      <w:hyperlink r:id="rIdcbybk0v1ilnkmjrqsvf3s" w:history="1">
         <w:r>
           <w:rPr>
             <w:rStyle w:val="Hyperlink"/>
@@ -243,7 +243,7 @@
         <w:rPr>
           <w:rFonts w:ascii="Calibri" w:cs="Calibri" w:eastAsia="Calibri" w:hAnsi="Calibri"/>
         </w:rPr>
-        <w:t xml:space="preserve">), con datos de escándalos municipales entre 1999 y 2009, muestran que un caso de corrupción reduce la confianza en los políticos y que ese efecto dura más que la propia percepción de corrupción.</w:t>
+        <w:t xml:space="preserve">) estudian los escándalos municipales entre 1999 y 2009, y muestran que un caso de corrupción reduce la confianza en los políticos durante más tiempo que la propia percepción de corrupción.</w:t>
       </w:r>
     </w:p>
     <w:p>
@@ -269,9 +269,9 @@
         <w:rPr>
           <w:rFonts w:ascii="Calibri" w:cs="Calibri" w:eastAsia="Calibri" w:hAnsi="Calibri"/>
         </w:rPr>
-        <w:t xml:space="preserve"> de las instituciones: la percepción de que los representantes no escuchan ni tienen en cuenta a los ciudadanos. Torcal (</w:t>
-      </w:r>
-      <w:hyperlink w:history="1" r:id="rIdf56p2f-wevrmg0yk0vcxv">
+        <w:t xml:space="preserve"> de las instituciones, es decir, la sensación de que los representantes no escuchan a los ciudadanos. Torcal (</w:t>
+      </w:r>
+      <w:hyperlink r:id="rIdf56p2f-wevrmg0yk0vcxv" w:history="1">
         <w:r>
           <w:rPr>
             <w:rStyle w:val="Hyperlink"/>
@@ -286,7 +286,7 @@
         <w:rPr>
           <w:rFonts w:ascii="Calibri" w:cs="Calibri" w:eastAsia="Calibri" w:hAnsi="Calibri"/>
         </w:rPr>
-        <w:t xml:space="preserve">), con datos de panel de 2011 y 2012, concluye que el deterioro de la confianza en España y Portugal se debe principalmente a esta percepción, agravada por la corrupción, y no tanto a la crisis económica.</w:t>
+        <w:t xml:space="preserve">), con datos de panel de 2011 y 2012, concluye que la confianza cayó en España y Portugal sobre todo por esta percepción, agravada por la corrupción, más que por la crisis económica.</w:t>
       </w:r>
     </w:p>
     <w:p>
@@ -312,9 +312,9 @@
         <w:rPr>
           <w:rFonts w:ascii="Calibri" w:cs="Calibri" w:eastAsia="Calibri" w:hAnsi="Calibri"/>
         </w:rPr>
-        <w:t xml:space="preserve">: cuando la economía empeora, la confianza cae. Torcal y Christmann (</w:t>
-      </w:r>
-      <w:hyperlink w:history="1" r:id="rIdsduo4t0gjyby40v6my_4e">
+        <w:t xml:space="preserve">. Cuando la economía empeora, la confianza cae. Torcal y Christmann (</w:t>
+      </w:r>
+      <w:hyperlink r:id="rIdsduo4t0gjyby40v6my_4e" w:history="1">
         <w:r>
           <w:rPr>
             <w:rStyle w:val="Hyperlink"/>
@@ -329,9 +329,9 @@
         <w:rPr>
           <w:rFonts w:ascii="Calibri" w:cs="Calibri" w:eastAsia="Calibri" w:hAnsi="Calibri"/>
         </w:rPr>
-        <w:t xml:space="preserve">), que estudian España entre 1997 y 2019, atribuyen a la Gran Recesión la caída de 2008-2012, pero concluyen que la confianza sigue baja por los escándalos de corrupción y la falta de respuesta del sistema. Van der Meer et al. (</w:t>
-      </w:r>
-      <w:hyperlink w:history="1" r:id="rIdzgnidas7bd2zdvbdofyng">
+        <w:t xml:space="preserve">) estudian España entre 1997 y 2019. Atribuyen a la Gran Recesión la caída de 2008-2012, pero creen que la confianza sigue baja por la corrupción y la falta de respuesta del sistema. Van der Meer et al. (</w:t>
+      </w:r>
+      <w:hyperlink r:id="rIdzgnidas7bd2zdvbdofyng" w:history="1">
         <w:r>
           <w:rPr>
             <w:rStyle w:val="Hyperlink"/>
@@ -346,19 +346,19 @@
         <w:rPr>
           <w:rFonts w:ascii="Calibri" w:cs="Calibri" w:eastAsia="Calibri" w:hAnsi="Calibri"/>
         </w:rPr>
-        <w:t xml:space="preserve">) detectan en España una desconexión duradera desde 2010, que atribuyen a los escándalos de corrupción de principios de esa década.</w:t>
-      </w:r>
-    </w:p>
-    <w:p>
-      <w:pPr>
-        <w:spacing w:after="160" w:line="300"/>
-        <w:jc w:val="both"/>
-      </w:pPr>
-      <w:r>
-        <w:rPr>
-          <w:rFonts w:ascii="Calibri" w:cs="Calibri" w:eastAsia="Calibri" w:hAnsi="Calibri"/>
-        </w:rPr>
-        <w:t xml:space="preserve">Frente a estas explicaciones, otra línea atribuye la desconfianza al </w:t>
+        <w:t xml:space="preserve">) también detectan en España una desconexión duradera desde 2010, ligada a los escándalos de principios de esa década.</w:t>
+      </w:r>
+    </w:p>
+    <w:p>
+      <w:pPr>
+        <w:spacing w:after="160" w:line="300"/>
+        <w:jc w:val="both"/>
+      </w:pPr>
+      <w:r>
+        <w:rPr>
+          <w:rFonts w:ascii="Calibri" w:cs="Calibri" w:eastAsia="Calibri" w:hAnsi="Calibri"/>
+        </w:rPr>
+        <w:t xml:space="preserve">Otra línea de investigación pone el acento en el </w:t>
       </w:r>
       <w:r>
         <w:rPr>
@@ -372,9 +372,9 @@
         <w:rPr>
           <w:rFonts w:ascii="Calibri" w:cs="Calibri" w:eastAsia="Calibri" w:hAnsi="Calibri"/>
         </w:rPr>
-        <w:t xml:space="preserve">: quienes pierden las elecciones valoran peor el sistema que quienes las ganan (</w:t>
-      </w:r>
-      <w:hyperlink w:history="1" r:id="rIdt90huunov9ubx3jv5geqt">
+        <w:t xml:space="preserve">. Quienes pierden las elecciones valoran peor el sistema que quienes las ganan (</w:t>
+      </w:r>
+      <w:hyperlink r:id="rIdt90huunov9ubx3jv5geqt" w:history="1">
         <w:r>
           <w:rPr>
             <w:rStyle w:val="Hyperlink"/>
@@ -391,7 +391,7 @@
         </w:rPr>
         <w:t xml:space="preserve">), y la polarización afectiva entre bloques reduce la confianza en las instituciones (</w:t>
       </w:r>
-      <w:hyperlink w:history="1" r:id="rId0gnnrs20vwpeame66spbt">
+      <w:hyperlink r:id="rId0gnnrs20vwpeame66spbt" w:history="1">
         <w:r>
           <w:rPr>
             <w:rStyle w:val="Hyperlink"/>
@@ -406,19 +406,19 @@
         <w:rPr>
           <w:rFonts w:ascii="Calibri" w:cs="Calibri" w:eastAsia="Calibri" w:hAnsi="Calibri"/>
         </w:rPr>
-        <w:t xml:space="preserve">).</w:t>
-      </w:r>
-    </w:p>
-    <w:p>
-      <w:pPr>
-        <w:spacing w:after="160" w:line="300"/>
-        <w:jc w:val="both"/>
-      </w:pPr>
-      <w:r>
-        <w:rPr>
-          <w:rFonts w:ascii="Calibri" w:cs="Calibri" w:eastAsia="Calibri" w:hAnsi="Calibri"/>
-        </w:rPr>
-        <w:t xml:space="preserve">Mi posición coincide con la literatura sobre España: la corrupción y la falta de respuesta son los motivos de fondo. Los datos de la ESS permiten comprobar directamente la segunda, así como el peso de la economía y del partidismo. La corrupción no se mide en la encuesta, como se explica en los límites.</w:t>
+        <w:t xml:space="preserve">). Si esta explicación fuera la correcta, la confianza dependería sobre todo de a quién se vota.</w:t>
+      </w:r>
+    </w:p>
+    <w:p>
+      <w:pPr>
+        <w:spacing w:after="160" w:line="300"/>
+        <w:jc w:val="both"/>
+      </w:pPr>
+      <w:r>
+        <w:rPr>
+          <w:rFonts w:ascii="Calibri" w:cs="Calibri" w:eastAsia="Calibri" w:hAnsi="Calibri"/>
+        </w:rPr>
+        <w:t xml:space="preserve">Mi posición coincide con la literatura sobre España. La corrupción y la falta de respuesta son los motivos de fondo. Con la ESS puedo comprobar la segunda y medir también el peso de la economía y del partidismo. La corrupción, en cambio, no se pregunta en la encuesta, como explico en los límites.</w:t>
       </w:r>
     </w:p>
     <w:p>
@@ -443,7 +443,7 @@
         </w:rPr>
         <w:t xml:space="preserve">He trabajado con los microdatos de la </w:t>
       </w:r>
-      <w:hyperlink w:history="1" r:id="rIdwz38jorerlfmsmiagqpw-">
+      <w:hyperlink r:id="rIdwz38jorerlfmsmiagqpw-" w:history="1">
         <w:r>
           <w:rPr>
             <w:rStyle w:val="Hyperlink"/>
@@ -458,7 +458,7 @@
         <w:rPr>
           <w:rFonts w:ascii="Calibri" w:cs="Calibri" w:eastAsia="Calibri" w:hAnsi="Calibri"/>
         </w:rPr>
-        <w:t xml:space="preserve"> para España, que preguntan desde 2002 por la confianza (de 0 a 10) en cada institución. He construido un </w:t>
+        <w:t xml:space="preserve"> para España, que desde 2002 preguntan por la confianza en cada institución en una escala de 0 a 10. Con ellos he construido un </w:t>
       </w:r>
       <w:r>
         <w:rPr>
@@ -472,7 +472,7 @@
         <w:rPr>
           <w:rFonts w:ascii="Calibri" w:cs="Calibri" w:eastAsia="Calibri" w:hAnsi="Calibri"/>
         </w:rPr>
-        <w:t xml:space="preserve"> que promedia la confianza en el Parlamento, los políticos y los partidos, y he clasificado como «desconfianza alta» a quien puntúa entre 0 y 3. Los detalles están en la nota metodológica.</w:t>
+        <w:t xml:space="preserve">, que es la media de la confianza en el Parlamento, los políticos y los partidos. Quien puntúa entre 0 y 3 entra en la categoría de «desconfianza alta». Los detalles están en la nota metodológica.</w:t>
       </w:r>
     </w:p>
     <w:p>
@@ -492,9 +492,9 @@
         <w:rPr>
           <w:rFonts w:ascii="Calibri" w:cs="Calibri" w:eastAsia="Calibri" w:hAnsi="Calibri"/>
         </w:rPr>
-        <w:t xml:space="preserve"> Entre 2004 y 2008 el índice se movía en torno al 4 y la desconfianza alta afectaba a un tercio de la población. En 2013 el índice cayó a 2,40 y la desconfianza alta llegó al 66%. Aquellos años juntaron una de las crisis económicas más profundas de la democracia con grandes casos de corrupción de PP y PSOE. En 2024, el índice está en 3,26 y casi la mitad de los españoles (48,9%) sigue en desconfianza alta. El dato de 2022 se marca aparte en el gráfico: ese año la encuesta se hizo en España sin entrevistador, y la propia ESS desaconseja compararlo sin cautela con el resto de rondas (</w:t>
-      </w:r>
-      <w:hyperlink w:history="1" r:id="rIdrmzcsmnq7ritbqirsfrl2">
+        <w:t xml:space="preserve"> Entre 2004 y 2008 el índice rondaba el 4 y la desconfianza alta afectaba a un tercio de la población. En 2013 el índice cayó a 2,40 y la desconfianza alta llegó al 66%. En esos años coincidieron una de las peores crisis económicas de la democracia y grandes casos de corrupción del PP y del PSOE. En 2024 el índice está en 3,26, y casi la mitad de los españoles (48,9%) sigue en desconfianza alta. El dato de 2022 aparece aparte en el gráfico porque ese año la encuesta se hizo en España sin entrevistador, y la propia ESS pide cautela al compararlo con otras rondas (</w:t>
+      </w:r>
+      <w:hyperlink r:id="rIdrmzcsmnq7ritbqirsfrl2" w:history="1">
         <w:r>
           <w:rPr>
             <w:rStyle w:val="Hyperlink"/>
@@ -511,7 +511,7 @@
         </w:rPr>
         <w:t xml:space="preserve">; </w:t>
       </w:r>
-      <w:hyperlink w:history="1" r:id="rIdfmohhuoaozjftqult7vyg">
+      <w:hyperlink r:id="rIdfmohhuoaozjftqult7vyg" w:history="1">
         <w:r>
           <w:rPr>
             <w:rStyle w:val="Hyperlink"/>
@@ -624,7 +624,7 @@
         <w:rPr>
           <w:rFonts w:ascii="Calibri" w:cs="Calibri" w:eastAsia="Calibri" w:hAnsi="Calibri"/>
         </w:rPr>
-        <w:t xml:space="preserve"> En 2024, políticos y partidos obtienen un 2,76 sobre 10; el Parlamento, un 4,29; la justicia, un 5,21, y la policía, un 6,92. Por eso el resto del análisis se centra en el índice de confianza política.</w:t>
+        <w:t xml:space="preserve"> En 2024, políticos y partidos obtienen un 2,76 sobre 10, el Parlamento un 4,29, la justicia un 5,21 y la policía un 6,92. Por eso el resto del análisis se centra en el índice de confianza política.</w:t>
       </w:r>
     </w:p>
     <w:p>
@@ -644,9 +644,9 @@
         <w:rPr>
           <w:rFonts w:ascii="Calibri" w:cs="Calibri" w:eastAsia="Calibri" w:hAnsi="Calibri"/>
         </w:rPr>
-        <w:t xml:space="preserve"> El 68% de los españoles cree que el sistema político permite a la gente tener «nada» o «muy poca» voz en lo que hace el Gobierno, una proporción que se mantiene entre el 67% y el 71% en 2017, 2019 y 2024. Es, además, donde más cambia la confianza: quienes creen que la gente no tiene «nada» de voz puntúan a la clase política con un 1,88; quienes creen que tiene «bastante o mucha», con un 4,87. La encuesta de la OCDE llega a la misma conclusión: en España, quienes sienten que no tienen voz confían 42 puntos porcentuales menos en el Gobierno que quienes sí (</w:t>
-      </w:r>
-      <w:hyperlink w:history="1" r:id="rId5ipobg_seklkr5ma5c9wy">
+        <w:t xml:space="preserve"> El 68% de los españoles cree que el sistema político da a la gente «nada» o «muy poca» voz en lo que hace el Gobierno, una proporción que apenas se mueve (entre el 67% y el 71% en 2017, 2019 y 2024). Además, es el factor que más separa a unos ciudadanos de otros. Quienes creen que la gente no tiene «nada» de voz ponen a la clase política un 1,88, y quienes creen que tiene «bastante o mucha», un 4,87. La OCDE llega a la misma conclusión, ya que en España quienes sienten que no tienen voz confían 42 puntos porcentuales menos en el Gobierno que el resto (</w:t>
+      </w:r>
+      <w:hyperlink r:id="rId5ipobg_seklkr5ma5c9wy" w:history="1">
         <w:r>
           <w:rPr>
             <w:rStyle w:val="Hyperlink"/>
@@ -675,13 +675,13 @@
           <w:b/>
           <w:bCs/>
         </w:rPr>
-        <w:t xml:space="preserve">4. La economía influye, pero no explica que la desconfianza persista.</w:t>
-      </w:r>
-      <w:r>
-        <w:rPr>
-          <w:rFonts w:ascii="Calibri" w:cs="Calibri" w:eastAsia="Calibri" w:hAnsi="Calibri"/>
-        </w:rPr>
-        <w:t xml:space="preserve"> Los insatisfechos con la economía puntúan a la clase política con un 2,06, y los satisfechos, con un 4,85. Sin embargo, entre 2013 y 2024 la satisfacción con la economía se duplicó (de 2,16 a 4,32) y la confianza solo subió 0,86 puntos (de 2,40 a 3,26). Es lo que anticipaban Torcal y Christmann (2021).</w:t>
+        <w:t xml:space="preserve">4. La economía influye, pero no explica que la desconfianza dure.</w:t>
+      </w:r>
+      <w:r>
+        <w:rPr>
+          <w:rFonts w:ascii="Calibri" w:cs="Calibri" w:eastAsia="Calibri" w:hAnsi="Calibri"/>
+        </w:rPr>
+        <w:t xml:space="preserve"> Los insatisfechos con la economía ponen a la clase política un 2,06, y los satisfechos, un 4,85. Sin embargo, entre 2013 y 2024 la satisfacción con la economía se duplicó (de 2,16 a 4,32), mientras que la confianza solo subió 0,86 puntos (de 2,40 a 3,26). Ya lo anticipaban Torcal y Christmann (2021).</w:t>
       </w:r>
     </w:p>
     <w:p>
@@ -701,19 +701,19 @@
         <w:rPr>
           <w:rFonts w:ascii="Calibri" w:cs="Calibri" w:eastAsia="Calibri" w:hAnsi="Calibri"/>
         </w:rPr>
-        <w:t xml:space="preserve"> Entre la izquierda (3,63) y la derecha (3,09) hay medio punto. Los votantes de los partidos del Gobierno confían algo más (3,81) que los de la oposición (2,73), como predice la tesis del partidismo, pero ninguno de estos grupos llega al 4. La desconfianza es transversal.</w:t>
-      </w:r>
-    </w:p>
-    <w:p>
-      <w:pPr>
-        <w:spacing w:after="160" w:line="300"/>
-        <w:jc w:val="both"/>
-      </w:pPr>
-      <w:r>
-        <w:rPr>
-          <w:rFonts w:ascii="Calibri" w:cs="Calibri" w:eastAsia="Calibri" w:hAnsi="Calibri"/>
-        </w:rPr>
-        <w:t xml:space="preserve">El gráfico 2 resume estas diferencias: cuanto más separadas están las barras de un factor, más influye.</w:t>
+        <w:t xml:space="preserve"> Entre la izquierda (3,63) y la derecha (3,09) hay medio punto. Los votantes de los partidos del Gobierno confían algo más (3,81) que los de la oposición (2,73), como predice la tesis del partidismo, pero ningún grupo llega al 4. La desconfianza atraviesa todos los bloques.</w:t>
+      </w:r>
+    </w:p>
+    <w:p>
+      <w:pPr>
+        <w:spacing w:after="160" w:line="300"/>
+        <w:jc w:val="both"/>
+      </w:pPr>
+      <w:r>
+        <w:rPr>
+          <w:rFonts w:ascii="Calibri" w:cs="Calibri" w:eastAsia="Calibri" w:hAnsi="Calibri"/>
+        </w:rPr>
+        <w:t xml:space="preserve">El gráfico 2 resume estas diferencias. Cuanto más separadas están las barras de un factor, más influye.</w:t>
       </w:r>
     </w:p>
     <w:p>
@@ -787,23 +787,22 @@
           <w:rFonts w:ascii="Calibri" w:cs="Calibri" w:eastAsia="Calibri" w:hAnsi="Calibri"/>
           <w:i/>
           <w:iCs/>
-          <w:color w:val="595959"/>
           <w:sz w:val="17"/>
           <w:szCs w:val="17"/>
         </w:rPr>
-        <w:t xml:space="preserve">Fuente: ESS ronda 11, España. Medias ponderadas. Voz política: «¿En qué medida el sistema político permite a personas como usted tener voz en lo que hace el Gobierno?».</w:t>
-      </w:r>
-    </w:p>
-    <w:p>
-      <w:pPr>
-        <w:spacing w:after="160" w:line="300"/>
-        <w:jc w:val="both"/>
-      </w:pPr>
-      <w:r>
-        <w:rPr>
-          <w:rFonts w:ascii="Calibri" w:cs="Calibri" w:eastAsia="Calibri" w:hAnsi="Calibri"/>
-        </w:rPr>
-        <w:t xml:space="preserve">El resultado se mantiene al analizar todos los factores a la vez mediante una regresión lineal (ver nota metodológica): la voz y la economía son los que más pesan, y la ideología no tiene efecto.</w:t>
+        <w:t xml:space="preserve">Fuente: ESS ronda 11, España. Medias ponderadas. La voz política se mide con la pregunta «¿En qué medida el sistema político permite a personas como usted tener voz en lo que hace el Gobierno?».</w:t>
+      </w:r>
+    </w:p>
+    <w:p>
+      <w:pPr>
+        <w:spacing w:after="160" w:line="300"/>
+        <w:jc w:val="both"/>
+      </w:pPr>
+      <w:r>
+        <w:rPr>
+          <w:rFonts w:ascii="Calibri" w:cs="Calibri" w:eastAsia="Calibri" w:hAnsi="Calibri"/>
+        </w:rPr>
+        <w:t xml:space="preserve">El resultado se mantiene cuando se analizan todos los factores a la vez con una regresión lineal (ver nota metodológica). La voz y la economía son los que más pesan, y la ideología no tiene efecto.</w:t>
       </w:r>
     </w:p>
     <w:p>
@@ -814,21 +813,21 @@
         <w:rPr>
           <w:rFonts w:ascii="Calibri" w:cs="Calibri" w:eastAsia="Calibri" w:hAnsi="Calibri"/>
         </w:rPr>
-        <w:t xml:space="preserve">La abstención: otra expresión de la desconfianza</w:t>
-      </w:r>
-    </w:p>
-    <w:p>
-      <w:pPr>
-        <w:spacing w:after="160" w:line="300"/>
-        <w:jc w:val="both"/>
-      </w:pPr>
-      <w:r>
-        <w:rPr>
-          <w:rFonts w:ascii="Calibri" w:cs="Calibri" w:eastAsia="Calibri" w:hAnsi="Calibri"/>
-        </w:rPr>
-        <w:t xml:space="preserve">En las generales de julio de 2023 la participación definitiva fue del 66,59%: más de doce millones y medio de electores no votaron (</w:t>
-      </w:r>
-      <w:hyperlink w:history="1" r:id="rIdk_wvmh1lvibnnrjc7psdx">
+        <w:t xml:space="preserve">La abstención, otra forma de desconfianza</w:t>
+      </w:r>
+    </w:p>
+    <w:p>
+      <w:pPr>
+        <w:spacing w:after="160" w:line="300"/>
+        <w:jc w:val="both"/>
+      </w:pPr>
+      <w:r>
+        <w:rPr>
+          <w:rFonts w:ascii="Calibri" w:cs="Calibri" w:eastAsia="Calibri" w:hAnsi="Calibri"/>
+        </w:rPr>
+        <w:t xml:space="preserve">En las generales de julio de 2023 la participación definitiva fue del 66,59%, así que más de doce millones y medio de electores no votaron (</w:t>
+      </w:r>
+      <w:hyperlink r:id="rIdk_wvmh1lvibnnrjc7psdx" w:history="1">
         <w:r>
           <w:rPr>
             <w:rStyle w:val="Hyperlink"/>
@@ -843,9 +842,9 @@
         <w:rPr>
           <w:rFonts w:ascii="Calibri" w:cs="Calibri" w:eastAsia="Calibri" w:hAnsi="Calibri"/>
         </w:rPr>
-        <w:t xml:space="preserve">). Leer esa cifra solo como apatía sería un error. En el Eurobarómetro posterior a las elecciones europeas de 2014, la falta de confianza en la política fue el primer motivo de abstención en España (30%) (</w:t>
-      </w:r>
-      <w:hyperlink w:history="1" r:id="rIdxpl2dyfvzjwbmwsouhmx3">
+        <w:t xml:space="preserve">). Sería un error leer esa cifra solo como apatía. En el Eurobarómetro posterior a las europeas de 2014, la falta de confianza en la política fue el primer motivo de abstención en España, con un 30% (</w:t>
+      </w:r>
+      <w:hyperlink r:id="rIdxpl2dyfvzjwbmwsouhmx3" w:history="1">
         <w:r>
           <w:rPr>
             <w:rStyle w:val="Hyperlink"/>
@@ -860,9 +859,9 @@
         <w:rPr>
           <w:rFonts w:ascii="Calibri" w:cs="Calibri" w:eastAsia="Calibri" w:hAnsi="Calibri"/>
         </w:rPr>
-        <w:t xml:space="preserve">), y en 2024 seguía siendo el primero en el conjunto de la UE (21%), por delante del desinterés (20%) (</w:t>
-      </w:r>
-      <w:hyperlink w:history="1" r:id="rIdldfh1mmayqds-5n43twzn">
+        <w:t xml:space="preserve">). En 2024 seguía siendo el primero en el conjunto de la UE (21%), por delante del desinterés (20%) (</w:t>
+      </w:r>
+      <w:hyperlink r:id="rIdldfh1mmayqds-5n43twzn" w:history="1">
         <w:r>
           <w:rPr>
             <w:rStyle w:val="Hyperlink"/>
@@ -889,9 +888,9 @@
         <w:rPr>
           <w:rFonts w:ascii="Calibri" w:cs="Calibri" w:eastAsia="Calibri" w:hAnsi="Calibri"/>
         </w:rPr>
-        <w:t xml:space="preserve">Según los microdatos de la ESS, quienes no votaron en 2023 confían menos en la clase política que quienes sí lo hicieron (2,85 frente a 3,20) y, en promedio, participan menos. Pero el 39% de ellos realizó en el último año al menos una actividad política fuera de las urnas: firmar una petición, manifestarse, boicotear productos, contactar con un político o publicar sobre política en internet. Es lo que describen Hooghe y Marien (</w:t>
-      </w:r>
-      <w:hyperlink w:history="1" r:id="rIduxhrlxmyeh8swi5r0mwtl">
+        <w:t xml:space="preserve">En la ESS, quienes no votaron en 2023 confían menos en la clase política que quienes sí lo hicieron (2,85 frente a 3,20) y, en general, participan menos. Sin embargo, el 39% hizo en el último año al menos una actividad política fuera de las urnas, como firmar una petición, manifestarse, boicotear productos, contactar con un político o publicar sobre política en internet. Hooghe y Marien (</w:t>
+      </w:r>
+      <w:hyperlink r:id="rIduxhrlxmyeh8swi5r0mwtl" w:history="1">
         <w:r>
           <w:rPr>
             <w:rStyle w:val="Hyperlink"/>
@@ -906,21 +905,21 @@
         <w:rPr>
           <w:rFonts w:ascii="Calibri" w:cs="Calibri" w:eastAsia="Calibri" w:hAnsi="Calibri"/>
         </w:rPr>
-        <w:t xml:space="preserve">) con datos europeos: la desconfianza aleja de las urnas, pero no necesariamente de la política. Y si lo político no se agota en el voto, esa abstención es también una decisión política.</w:t>
-      </w:r>
-    </w:p>
-    <w:p>
-      <w:pPr>
-        <w:spacing w:after="160" w:line="300"/>
-        <w:jc w:val="both"/>
-      </w:pPr>
-      <w:r>
-        <w:rPr>
-          <w:rFonts w:ascii="Calibri" w:cs="Calibri" w:eastAsia="Calibri" w:hAnsi="Calibri"/>
-        </w:rPr>
-        <w:t xml:space="preserve">Conviene no idealizarla. Justel (</w:t>
-      </w:r>
-      <w:hyperlink w:history="1" r:id="rIdJustel1995">
+        <w:t xml:space="preserve">) describen lo mismo con datos europeos. La desconfianza aleja de las urnas, pero no necesariamente de la política. Si entendemos lo político como algo más amplio que el voto, parte de esa abstención es también una decisión política.</w:t>
+      </w:r>
+    </w:p>
+    <w:p>
+      <w:pPr>
+        <w:spacing w:after="160" w:line="300"/>
+        <w:jc w:val="both"/>
+      </w:pPr>
+      <w:r>
+        <w:rPr>
+          <w:rFonts w:ascii="Calibri" w:cs="Calibri" w:eastAsia="Calibri" w:hAnsi="Calibri"/>
+        </w:rPr>
+        <w:t xml:space="preserve">Tampoco hay que idealizarla. Justel (</w:t>
+      </w:r>
+      <w:hyperlink r:id="rIdJustel1995" w:history="1">
         <w:r>
           <w:rPr>
             <w:rStyle w:val="Hyperlink"/>
@@ -935,9 +934,9 @@
         <w:rPr>
           <w:rFonts w:ascii="Calibri" w:cs="Calibri" w:eastAsia="Calibri" w:hAnsi="Calibri"/>
         </w:rPr>
-        <w:t xml:space="preserve">) ya distinguía entre una abstención estructural, ligada a la falta de recursos, y una voluntaria en aumento. Y las formas de participación no electoral están sesgadas hacia quienes tienen más estudios (Marien, Hooghe y Quintelier, </w:t>
-      </w:r>
-      <w:hyperlink w:history="1" r:id="rIdMarien2010">
+        <w:t xml:space="preserve">) ya distinguía entre una abstención estructural, ligada a la falta de recursos, y una abstención voluntaria que iba en aumento. Además, la participación fuera de las urnas es más frecuente entre quienes tienen más estudios (Marien, Hooghe y Quintelier, </w:t>
+      </w:r>
+      <w:hyperlink r:id="rIdMarien2010" w:history="1">
         <w:r>
           <w:rPr>
             <w:rStyle w:val="Hyperlink"/>
@@ -952,7 +951,7 @@
         <w:rPr>
           <w:rFonts w:ascii="Calibri" w:cs="Calibri" w:eastAsia="Calibri" w:hAnsi="Calibri"/>
         </w:rPr>
-        <w:t xml:space="preserve">). Junto a la abstención crítica hay otra de exclusión social, aunque una parte relevante expresa la desconfianza hacia los representantes.</w:t>
+        <w:t xml:space="preserve">). Junto a la abstención crítica hay, por tanto, otra que nace de la exclusión social. Aun así, una parte relevante de quienes no votan está expresando su desconfianza hacia los representantes.</w:t>
       </w:r>
     </w:p>
     <w:p>
@@ -975,21 +974,21 @@
         <w:rPr>
           <w:rFonts w:ascii="Calibri" w:cs="Calibri" w:eastAsia="Calibri" w:hAnsi="Calibri"/>
         </w:rPr>
-        <w:t xml:space="preserve">La objeción más seria a esta tesis es metodológica, y tiene dos partes. La primera: la ESS no pregunta por la corrupción de los políticos, así que su relación con la sensación de no tener voz es una interpretación apoyada en la literatura, no un resultado medido. La segunda: la regresión muestra asociación, no causalidad. Es posible que la relación funcione también en sentido inverso, y que quien ya desconfía de los políticos perciba que no tiene voz.</w:t>
-      </w:r>
-    </w:p>
-    <w:p>
-      <w:pPr>
-        <w:spacing w:after="160" w:line="300"/>
-        <w:jc w:val="both"/>
-      </w:pPr>
-      <w:r>
-        <w:rPr>
-          <w:rFonts w:ascii="Calibri" w:cs="Calibri" w:eastAsia="Calibri" w:hAnsi="Calibri"/>
-        </w:rPr>
-        <w:t xml:space="preserve">Hay indicios externos que refuerzan la interpretación. En el Índice de Percepción de la Corrupción de Transparencia Internacional, España obtuvo 55 puntos sobre 100 en 2025, su peor puntuación desde 2012, y cayó al puesto 49 de 182 países (</w:t>
-      </w:r>
-      <w:hyperlink w:history="1" r:id="rIdjpef7ssfgsipuwkgh8fui">
+        <w:t xml:space="preserve">La objeción más seria a esta tesis es metodológica, y tiene dos partes. Por un lado, la ESS no pregunta por la corrupción, así que su relación con la sensación de no tener voz es una interpretación basada en la literatura, no un resultado medido. Por otro, la regresión muestra asociación, no causalidad. La relación podría funcionar también al revés, de modo que quien ya desconfía de los políticos sienta que no tiene voz.</w:t>
+      </w:r>
+    </w:p>
+    <w:p>
+      <w:pPr>
+        <w:spacing w:after="160" w:line="300"/>
+        <w:jc w:val="both"/>
+      </w:pPr>
+      <w:r>
+        <w:rPr>
+          <w:rFonts w:ascii="Calibri" w:cs="Calibri" w:eastAsia="Calibri" w:hAnsi="Calibri"/>
+        </w:rPr>
+        <w:t xml:space="preserve">Hay datos externos que refuerzan esta interpretación. En el Índice de Percepción de la Corrupción de Transparencia Internacional, España obtuvo 55 puntos sobre 100 en 2025, su peor nota desde 2012, y cayó al puesto 49 de 182 países (</w:t>
+      </w:r>
+      <w:hyperlink r:id="rIdjpef7ssfgsipuwkgh8fui" w:history="1">
         <w:r>
           <w:rPr>
             <w:rStyle w:val="Hyperlink"/>
@@ -1004,9 +1003,9 @@
         <w:rPr>
           <w:rFonts w:ascii="Calibri" w:cs="Calibri" w:eastAsia="Calibri" w:hAnsi="Calibri"/>
         </w:rPr>
-        <w:t xml:space="preserve">); en 2019 ocupaba el puesto 30, con 62 puntos (</w:t>
-      </w:r>
-      <w:hyperlink w:history="1" r:id="rIdehgiehbnkjdpb23qe7axb">
+        <w:t xml:space="preserve">). En 2019 ocupaba el puesto 30, con 62 puntos (</w:t>
+      </w:r>
+      <w:hyperlink r:id="rIdehgiehbnkjdpb23qe7axb" w:history="1">
         <w:r>
           <w:rPr>
             <w:rStyle w:val="Hyperlink"/>
@@ -1021,19 +1020,19 @@
         <w:rPr>
           <w:rFonts w:ascii="Calibri" w:cs="Calibri" w:eastAsia="Calibri" w:hAnsi="Calibri"/>
         </w:rPr>
-        <w:t xml:space="preserve">). Cuando la percepción de corrupción empeora mientras la economía mejora, es difícil atribuir la desconfianza solo a la crisis. Hay que recordar, eso sí, que este índice recoge la percepción de expertos, no la opinión de la ciudadanía.</w:t>
-      </w:r>
-    </w:p>
-    <w:p>
-      <w:pPr>
-        <w:spacing w:after="160" w:line="300"/>
-        <w:jc w:val="both"/>
-      </w:pPr>
-      <w:r>
-        <w:rPr>
-          <w:rFonts w:ascii="Calibri" w:cs="Calibri" w:eastAsia="Calibri" w:hAnsi="Calibri"/>
-        </w:rPr>
-        <w:t xml:space="preserve">Además, la confianza es una </w:t>
+        <w:t xml:space="preserve">). Si la percepción de corrupción empeora mientras la economía mejora, es difícil culpar solo a la crisis. Eso sí, este índice recoge la opinión de expertos, no la de la ciudadanía.</w:t>
+      </w:r>
+    </w:p>
+    <w:p>
+      <w:pPr>
+        <w:spacing w:after="160" w:line="300"/>
+        <w:jc w:val="both"/>
+      </w:pPr>
+      <w:r>
+        <w:rPr>
+          <w:rFonts w:ascii="Calibri" w:cs="Calibri" w:eastAsia="Calibri" w:hAnsi="Calibri"/>
+        </w:rPr>
+        <w:t xml:space="preserve">También hay que recordar que la confianza es una </w:t>
       </w:r>
       <w:r>
         <w:rPr>
@@ -1047,21 +1046,21 @@
         <w:rPr>
           <w:rFonts w:ascii="Calibri" w:cs="Calibri" w:eastAsia="Calibri" w:hAnsi="Calibri"/>
         </w:rPr>
-        <w:t xml:space="preserve">, no un hecho, y lo que se declara no siempre coincide con lo que se hace: en la ESS dice haber votado el 78,8% de los electores, frente al 66,59% oficial. Las escalas de 0 a 10 dicen cuánto se desconfía, pero no qué se entiende por «políticos»; captarlo exigiría técnicas cualitativas, como grupos de discusión.</w:t>
-      </w:r>
-    </w:p>
-    <w:p>
-      <w:pPr>
-        <w:spacing w:after="160" w:line="300"/>
-        <w:jc w:val="both"/>
-      </w:pPr>
-      <w:r>
-        <w:rPr>
-          <w:rFonts w:ascii="Calibri" w:cs="Calibri" w:eastAsia="Calibri" w:hAnsi="Calibri"/>
-        </w:rPr>
-        <w:t xml:space="preserve">Por último, la elección de la fuente. He preferido la ESS a los barómetros del CIS, cuya neutralidad se ha cuestionado en los últimos años (</w:t>
-      </w:r>
-      <w:hyperlink w:history="1" r:id="rIdsgegerem4qya0hifr-iby">
+        <w:t xml:space="preserve">, no un hecho, y lo que la gente declara no siempre coincide con lo que hace. En la ESS dice haber votado el 78,8% de los electores, frente al 66,59% oficial. Las escalas de 0 a 10 miden cuánto se desconfía, pero no qué entiende cada persona por «políticos». Para eso harían falta técnicas cualitativas, como los grupos de discusión.</w:t>
+      </w:r>
+    </w:p>
+    <w:p>
+      <w:pPr>
+        <w:spacing w:after="160" w:line="300"/>
+        <w:jc w:val="both"/>
+      </w:pPr>
+      <w:r>
+        <w:rPr>
+          <w:rFonts w:ascii="Calibri" w:cs="Calibri" w:eastAsia="Calibri" w:hAnsi="Calibri"/>
+        </w:rPr>
+        <w:t xml:space="preserve">Por último, he preferido la ESS a los barómetros del CIS, cuya neutralidad se ha cuestionado en los últimos años (</w:t>
+      </w:r>
+      <w:hyperlink r:id="rIdsgegerem4qya0hifr-iby" w:history="1">
         <w:r>
           <w:rPr>
             <w:rStyle w:val="Hyperlink"/>
@@ -1076,9 +1075,9 @@
         <w:rPr>
           <w:rFonts w:ascii="Calibri" w:cs="Calibri" w:eastAsia="Calibri" w:hAnsi="Calibri"/>
         </w:rPr>
-        <w:t xml:space="preserve">). Conviene precisar que, desde 2014, el propio CIS coordina en España el trabajo de campo de la ESS; la diferencia es que el cuestionario, el muestreo y el control de calidad los fija el equipo científico europeo de la encuesta (</w:t>
-      </w:r>
-      <w:hyperlink w:history="1" r:id="rId5-yvo_0or_nlkjf-vmioa">
+        <w:t xml:space="preserve">). Es cierto que, desde 2014, el propio CIS coordina en España el trabajo de campo de la ESS. Pero el cuestionario, la muestra y el control de calidad los fija el equipo científico europeo de la encuesta (</w:t>
+      </w:r>
+      <w:hyperlink r:id="rId5-yvo_0or_nlkjf-vmioa" w:history="1">
         <w:r>
           <w:rPr>
             <w:rStyle w:val="Hyperlink"/>
@@ -1093,7 +1092,7 @@
         <w:rPr>
           <w:rFonts w:ascii="Calibri" w:cs="Calibri" w:eastAsia="Calibri" w:hAnsi="Calibri"/>
         </w:rPr>
-        <w:t xml:space="preserve">). Que haya que justificar así la elección de una fuente es, en sí mismo, un indicio del clima de desconfianza que analiza este artículo.</w:t>
+        <w:t xml:space="preserve">). Que haya que justificar tanto la elección de una fuente ya dice algo del clima de desconfianza que analiza este artículo.</w:t>
       </w:r>
     </w:p>
     <w:p>
@@ -1116,31 +1115,31 @@
         <w:rPr>
           <w:rFonts w:ascii="Calibri" w:cs="Calibri" w:eastAsia="Calibri" w:hAnsi="Calibri"/>
         </w:rPr>
-        <w:t xml:space="preserve">La desconfianza hacia la clase política es el dato que mejor resume la política española actual: seis de cada diez ciudadanos puntúan a políticos y partidos entre 0 y 3.</w:t>
-      </w:r>
-    </w:p>
-    <w:p>
-      <w:pPr>
-        <w:spacing w:after="160" w:line="300"/>
-        <w:jc w:val="both"/>
-      </w:pPr>
-      <w:r>
-        <w:rPr>
-          <w:rFonts w:ascii="Calibri" w:cs="Calibri" w:eastAsia="Calibri" w:hAnsi="Calibri"/>
-        </w:rPr>
-        <w:t xml:space="preserve">Sus motivos no son principalmente ideológicos. La polarización y el partidismo existen, pero explican poco. Lo que más pesa es la percepción de que la ciudadanía no tiene voz en lo que hace el Gobierno, junto con la valoración de la economía. Y como la economía se ha recuperado mucho más que la confianza, la explicación de fondo es política: un déficit de representación que los casos de corrupción refuerzan y que se manifiesta tanto en las encuestas como en una parte de la abstención.</w:t>
-      </w:r>
-    </w:p>
-    <w:p>
-      <w:pPr>
-        <w:spacing w:after="160" w:line="300"/>
-        <w:jc w:val="both"/>
-      </w:pPr>
-      <w:r>
-        <w:rPr>
-          <w:rFonts w:ascii="Calibri" w:cs="Calibri" w:eastAsia="Calibri" w:hAnsi="Calibri"/>
-        </w:rPr>
-        <w:t xml:space="preserve">De ello se deriva una implicación para las elecciones del 29 de noviembre. Si la desconfianza fuera económica, bastaría con el crecimiento; si fuera ideológica, con un cambio de Gobierno. Los datos indican que ninguna de las dos cosas bastaría por sí sola. Revertirla exigiría, sobre todo, reformas que aumenten la transparencia y la capacidad de respuesta de las instituciones.</w:t>
+        <w:t xml:space="preserve">La desconfianza hacia la clase política es el dato que mejor resume la política española actual. Seis de cada diez ciudadanos ponen a políticos y partidos entre 0 y 3.</w:t>
+      </w:r>
+    </w:p>
+    <w:p>
+      <w:pPr>
+        <w:spacing w:after="160" w:line="300"/>
+        <w:jc w:val="both"/>
+      </w:pPr>
+      <w:r>
+        <w:rPr>
+          <w:rFonts w:ascii="Calibri" w:cs="Calibri" w:eastAsia="Calibri" w:hAnsi="Calibri"/>
+        </w:rPr>
+        <w:t xml:space="preserve">Sus motivos no son, sobre todo, ideológicos, y el voto también influye poco. Lo que más pesa es la sensación de que la ciudadanía no tiene voz en lo que hace el Gobierno, junto con la valoración de la economía. Y como la economía se ha recuperado mucho más que la confianza, la causa de fondo es política. Hay un déficit de representación que los casos de corrupción refuerzan y que se ve tanto en las encuestas como en una parte de la abstención.</w:t>
+      </w:r>
+    </w:p>
+    <w:p>
+      <w:pPr>
+        <w:spacing w:after="160" w:line="300"/>
+        <w:jc w:val="both"/>
+      </w:pPr>
+      <w:r>
+        <w:rPr>
+          <w:rFonts w:ascii="Calibri" w:cs="Calibri" w:eastAsia="Calibri" w:hAnsi="Calibri"/>
+        </w:rPr>
+        <w:t xml:space="preserve">Esto tiene consecuencias para las elecciones del 29 de noviembre. Si la desconfianza fuera económica, bastaría con que la economía creciera, y si fuera ideológica, con un cambio de Gobierno. Los datos indican que ninguna de las dos cosas basta por sí sola. Para revertirla harían falta, sobre todo, reformas que hagan las instituciones más transparentes y más atentas a lo que pide la ciudadanía.</w:t>
       </w:r>
     </w:p>
     <w:p>

</xml_diff>

<commit_message>
Verificar cifras con los microdatos de la ESS y ampliar el Excel (hojas T6-T9)
Co-Authored-By: Claude Opus 5.5 <noreply@anthropic.com>
Claude-Session: https://claude.ai/code/session_0151xMeAGxojZGQ6vZDDk9eo
</commit_message>
<xml_diff>
--- a/Articulo_desconfianza_clase_politica.docx
+++ b/Articulo_desconfianza_clase_politica.docx
@@ -472,7 +472,7 @@
         <w:rPr>
           <w:rFonts w:ascii="Calibri" w:cs="Calibri" w:eastAsia="Calibri" w:hAnsi="Calibri"/>
         </w:rPr>
-        <w:t xml:space="preserve">, que es la media de la confianza en el Parlamento, los políticos y los partidos. Quien puntúa entre 0 y 3 entra en la categoría de «desconfianza alta». Los detalles están en la nota metodológica.</w:t>
+        <w:t xml:space="preserve">, que es la media de la confianza en el Parlamento, los políticos y los partidos. Quien puntúa entre 0 y 3 entra en la categoría de «desconfianza alta».</w:t>
       </w:r>
     </w:p>
     <w:p>
@@ -888,7 +888,7 @@
         <w:rPr>
           <w:rFonts w:ascii="Calibri" w:cs="Calibri" w:eastAsia="Calibri" w:hAnsi="Calibri"/>
         </w:rPr>
-        <w:t xml:space="preserve">En la ESS, quienes no votaron en 2023 confían menos en la clase política que quienes sí lo hicieron (2,85 frente a 3,20) y, en general, participan menos. Sin embargo, el 39% hizo en el último año al menos una actividad política fuera de las urnas, como firmar una petición, manifestarse, boicotear productos, contactar con un político o publicar sobre política en internet. Hooghe y Marien (</w:t>
+        <w:t xml:space="preserve">En la ESS, quienes no votaron en 2023 confían menos en la clase política que quienes sí lo hicieron (2,85 frente a 3,20). También participan menos fuera de las urnas, pero no se desentienden de la política. El 38,5% hizo en el último año al menos una actividad política, como firmar una petición, manifestarse, boicotear productos, contactar con un político o publicar sobre política en internet (entre los votantes, el 55%). Hooghe y Marien (</w:t>
       </w:r>
       <w:hyperlink r:id="rIduxhrlxmyeh8swi5r0mwtl" w:history="1">
         <w:r>
@@ -951,7 +951,7 @@
         <w:rPr>
           <w:rFonts w:ascii="Calibri" w:cs="Calibri" w:eastAsia="Calibri" w:hAnsi="Calibri"/>
         </w:rPr>
-        <w:t xml:space="preserve">). Junto a la abstención crítica hay, por tanto, otra que nace de la exclusión social. Aun así, una parte relevante de quienes no votan está expresando su desconfianza hacia los representantes.</w:t>
+        <w:t xml:space="preserve">). Junto a la abstención crítica hay, por tanto, otra que nace de la exclusión social. Aun así, una parte relevante de la abstención expresa desconfianza hacia los representantes.</w:t>
       </w:r>
     </w:p>
     <w:p>
@@ -2677,7 +2677,7 @@
         <w:rPr>
           <w:rFonts w:ascii="Calibri" w:cs="Calibri" w:eastAsia="Calibri" w:hAnsi="Calibri"/>
         </w:rPr>
-        <w:t xml:space="preserve"> La participación declarada en la ESS (78,8% de los electores) supera a la oficial (66,59%), un sesgo habitual en las encuestas: los no votantes de la muestra pueden ser algo distintos de los reales. El cálculo completo, con todas las tablas, está en el Excel anexo.</w:t>
+        <w:t xml:space="preserve"> La participación declarada en la ESS (78,8% de los electores) supera a la oficial (66,59%), un sesgo habitual en las encuestas: los no votantes de la muestra pueden ser algo distintos de los reales. El cálculo completo, con todas las tablas (incluidas la voz política, la abstención y la regresión, en las hojas T6 a T9), está en el Excel anexo.</w:t>
       </w:r>
     </w:p>
     <w:sectPr>

</xml_diff>

<commit_message>
Reescribir el punto 5 y la lectura del gráfico 2 para que se entiendan mejor
Co-Authored-By: Claude Opus 5.5 <noreply@anthropic.com>
Claude-Session: https://claude.ai/code/session_0151xMeAGxojZGQ6vZDDk9eo
</commit_message>
<xml_diff>
--- a/Articulo_desconfianza_clase_politica.docx
+++ b/Articulo_desconfianza_clase_politica.docx
@@ -119,7 +119,7 @@
         <w:rPr>
           <w:rFonts w:ascii="Calibri" w:cs="Calibri" w:eastAsia="Calibri" w:hAnsi="Calibri"/>
         </w:rPr>
-        <w:t xml:space="preserve">). Estos casos tienen un recorrido judicial, pero también plantean una pregunta política. ¿Cuánto confían los españoles en quienes los representan?</w:t>
+        <w:t xml:space="preserve">). Estos casos plantean también una pregunta política. ¿Cuánto confían los españoles en quienes los representan?</w:t>
       </w:r>
     </w:p>
     <w:p>
@@ -418,7 +418,7 @@
         <w:rPr>
           <w:rFonts w:ascii="Calibri" w:cs="Calibri" w:eastAsia="Calibri" w:hAnsi="Calibri"/>
         </w:rPr>
-        <w:t xml:space="preserve">Mi posición coincide con la literatura sobre España. La corrupción y la falta de respuesta son los motivos de fondo. Con la ESS puedo comprobar la segunda y medir también el peso de la economía y del partidismo. La corrupción, en cambio, no se pregunta en la encuesta, como explico en los límites.</w:t>
+        <w:t xml:space="preserve">Mi posición coincide con la literatura sobre España. La corrupción y la falta de respuesta son los motivos de fondo. Con la ESS puedo comprobar la segunda y medir el peso de la economía y del partidismo. La corrupción, en cambio, no se pregunta en la encuesta, como explico en los límites.</w:t>
       </w:r>
     </w:p>
     <w:p>
@@ -644,7 +644,7 @@
         <w:rPr>
           <w:rFonts w:ascii="Calibri" w:cs="Calibri" w:eastAsia="Calibri" w:hAnsi="Calibri"/>
         </w:rPr>
-        <w:t xml:space="preserve"> El 68% de los españoles cree que el sistema político da a la gente «nada» o «muy poca» voz en lo que hace el Gobierno, una proporción que apenas se mueve (entre el 67% y el 71% en 2017, 2019 y 2024). Además, es el factor que más separa a unos ciudadanos de otros. Quienes creen que la gente no tiene «nada» de voz ponen a la clase política un 1,88, y quienes creen que tiene «bastante o mucha», un 4,87. La OCDE llega a la misma conclusión, ya que en España quienes sienten que no tienen voz confían 42 puntos porcentuales menos en el Gobierno que el resto (</w:t>
+        <w:t xml:space="preserve"> El 68% de los españoles cree que el sistema político da a la gente «nada» o «muy poca» voz en lo que hace el Gobierno, una proporción que apenas se mueve (entre el 67% y el 71% en 2017, 2019 y 2024). Quienes creen que la gente no tiene «nada» de voz ponen a la clase política un 1,88, y quienes creen que tiene «bastante o mucha», un 4,87. La OCDE llega a la misma conclusión, ya que en España quienes sienten que no tienen voz confían 42 puntos porcentuales menos en el Gobierno que el resto (</w:t>
       </w:r>
       <w:hyperlink r:id="rId5ipobg_seklkr5ma5c9wy" w:history="1">
         <w:r>
@@ -695,25 +695,25 @@
           <w:b/>
           <w:bCs/>
         </w:rPr>
-        <w:t xml:space="preserve">5. La ideología y el voto apenas marcan diferencias.</w:t>
-      </w:r>
-      <w:r>
-        <w:rPr>
-          <w:rFonts w:ascii="Calibri" w:cs="Calibri" w:eastAsia="Calibri" w:hAnsi="Calibri"/>
-        </w:rPr>
-        <w:t xml:space="preserve"> Entre la izquierda (3,63) y la derecha (3,09) hay medio punto. Los votantes de los partidos del Gobierno confían algo más (3,81) que los de la oposición (2,73), como predice la tesis del partidismo, pero ningún grupo llega al 4. La desconfianza atraviesa todos los bloques.</w:t>
-      </w:r>
-    </w:p>
-    <w:p>
-      <w:pPr>
-        <w:spacing w:after="160" w:line="300"/>
-        <w:jc w:val="both"/>
-      </w:pPr>
-      <w:r>
-        <w:rPr>
-          <w:rFonts w:ascii="Calibri" w:cs="Calibri" w:eastAsia="Calibri" w:hAnsi="Calibri"/>
-        </w:rPr>
-        <w:t xml:space="preserve">El gráfico 2 resume estas diferencias. Cuanto más separadas están las barras de un factor, más influye.</w:t>
+        <w:t xml:space="preserve">5. La ideología apenas influye, y el voto, poco.</w:t>
+      </w:r>
+      <w:r>
+        <w:rPr>
+          <w:rFonts w:ascii="Calibri" w:cs="Calibri" w:eastAsia="Calibri" w:hAnsi="Calibri"/>
+        </w:rPr>
+        <w:t xml:space="preserve"> Entre la izquierda (3,63) y la derecha (3,09) hay medio punto. Los votantes de PSOE y Sumar confían algo más (3,81) que los de PP y VOX (2,73), como predice la tesis del partidismo. Pero incluso quienes votan a los partidos del Gobierno suspenden a la clase política, así que la desconfianza no es cosa de un solo bloque.</w:t>
+      </w:r>
+    </w:p>
+    <w:p>
+      <w:pPr>
+        <w:spacing w:after="160" w:line="300"/>
+        <w:jc w:val="both"/>
+      </w:pPr>
+      <w:r>
+        <w:rPr>
+          <w:rFonts w:ascii="Calibri" w:cs="Calibri" w:eastAsia="Calibri" w:hAnsi="Calibri"/>
+        </w:rPr>
+        <w:t xml:space="preserve">El gráfico 2 compara los cuatro factores. La ideología separa a los grupos medio punto, y el voto, uno. La economía y la voz los separan casi tres puntos, y por eso son los factores que más pesan.</w:t>
       </w:r>
     </w:p>
     <w:p>
@@ -802,7 +802,7 @@
         <w:rPr>
           <w:rFonts w:ascii="Calibri" w:cs="Calibri" w:eastAsia="Calibri" w:hAnsi="Calibri"/>
         </w:rPr>
-        <w:t xml:space="preserve">El resultado se mantiene cuando se analizan todos los factores a la vez con una regresión lineal (ver nota metodológica). La voz y la economía son los que más pesan, y la ideología no tiene efecto.</w:t>
+        <w:t xml:space="preserve">Una regresión lineal que analiza todos los factores a la vez confirma este resultado (ver nota metodológica).</w:t>
       </w:r>
     </w:p>
     <w:p>

</xml_diff>